<commit_message>
Add animated scroll version and always-visible QR code
story.html presents the same material through sticky scroll-driven
stages (problem, block anatomy per control, two-patient assembly) and
reveal animations, linked to and from the classic page. Both pages
carry a fixed, shrinkable QR code to their published URL. Shared HTML
moved to build/fragments.mjs; build deps pinned in package.json.

Co-Authored-By: Claude Opus 5.5 <noreply@anthropic.com>
Claude-Session: https://claude.ai/code/session_014iqtVQZmni32eDvTQgfnDb
</commit_message>
<xml_diff>
--- a/downloads/Controlled-Substance-Agreement-Clause-Library.docx
+++ b/downloads/Controlled-Substance-Agreement-Clause-Library.docx
@@ -6652,7 +6652,7 @@
         </w:rPr>
         <w:t xml:space="preserve"> </w:t>
       </w:r>
-      <w:hyperlink w:history="1" r:id="rIdtcgj-4u-kfdzrtyi6jgsz">
+      <w:hyperlink w:history="1" r:id="rIdwnbkc74atitcom1thy60w">
         <w:r>
           <w:rPr>
             <w:rStyle w:val="Hyperlink"/>
@@ -6682,7 +6682,7 @@
         </w:rPr>
         <w:t xml:space="preserve"> </w:t>
       </w:r>
-      <w:hyperlink w:history="1" r:id="rId3_lmzf2iouq6mh4gj7wqt">
+      <w:hyperlink w:history="1" r:id="rIdy40oa11in3xohijrewjz-">
         <w:r>
           <w:rPr>
             <w:rStyle w:val="Hyperlink"/>
@@ -6712,7 +6712,7 @@
         </w:rPr>
         <w:t xml:space="preserve"> </w:t>
       </w:r>
-      <w:hyperlink w:history="1" r:id="rIdpslscrad09wngqsjgphdp">
+      <w:hyperlink w:history="1" r:id="rIdq6cx8uz7dxgtnryf6vrt-">
         <w:r>
           <w:rPr>
             <w:rStyle w:val="Hyperlink"/>
@@ -6742,7 +6742,7 @@
         </w:rPr>
         <w:t xml:space="preserve"> </w:t>
       </w:r>
-      <w:hyperlink w:history="1" r:id="rIdx8agbgaecikm2_dmdtu3x">
+      <w:hyperlink w:history="1" r:id="rIdivgrvrwml2tzna9ltgn4p">
         <w:r>
           <w:rPr>
             <w:rStyle w:val="Hyperlink"/>
@@ -6772,7 +6772,7 @@
         </w:rPr>
         <w:t xml:space="preserve"> </w:t>
       </w:r>
-      <w:hyperlink w:history="1" r:id="rIdrtmeu-kjw-ecrekrquluz">
+      <w:hyperlink w:history="1" r:id="rId6ytqryws7saoxliqu1pea">
         <w:r>
           <w:rPr>
             <w:rStyle w:val="Hyperlink"/>
@@ -6815,7 +6815,7 @@
         </w:rPr>
         <w:t xml:space="preserve"> </w:t>
       </w:r>
-      <w:hyperlink w:history="1" r:id="rIdq5vfyndj1fcski0qrzwwf">
+      <w:hyperlink w:history="1" r:id="rIdg0vl_4sdo5n8d5x21d9tr">
         <w:r>
           <w:rPr>
             <w:rStyle w:val="Hyperlink"/>
@@ -6871,7 +6871,7 @@
         </w:rPr>
         <w:t xml:space="preserve"> </w:t>
       </w:r>
-      <w:hyperlink w:history="1" r:id="rIdw25wienkxixmsljdsc4a1">
+      <w:hyperlink w:history="1" r:id="rIdpirq9lrulvraogndquyum">
         <w:r>
           <w:rPr>
             <w:rStyle w:val="Hyperlink"/>
@@ -6901,7 +6901,7 @@
         </w:rPr>
         <w:t xml:space="preserve"> </w:t>
       </w:r>
-      <w:hyperlink w:history="1" r:id="rIdzjsnm8zckkxxw8chgwo9o">
+      <w:hyperlink w:history="1" r:id="rIdrxxqvlasdezpy_hlgpdwn">
         <w:r>
           <w:rPr>
             <w:rStyle w:val="Hyperlink"/>
@@ -6996,7 +6996,7 @@
         </w:rPr>
         <w:t xml:space="preserve"> </w:t>
       </w:r>
-      <w:hyperlink w:history="1" r:id="rId0xzoa_fywrbcnwi-bz6c4">
+      <w:hyperlink w:history="1" r:id="rIdgy1_ro_9nwph0rh28fw3i">
         <w:r>
           <w:rPr>
             <w:rStyle w:val="Hyperlink"/>
@@ -7026,7 +7026,7 @@
         </w:rPr>
         <w:t xml:space="preserve"> </w:t>
       </w:r>
-      <w:hyperlink w:history="1" r:id="rIdm48frwi7mb0ed_aawo3vy">
+      <w:hyperlink w:history="1" r:id="rId4egzr6ybr3b50-qgjpxjo">
         <w:r>
           <w:rPr>
             <w:rStyle w:val="Hyperlink"/>
@@ -7056,7 +7056,7 @@
         </w:rPr>
         <w:t xml:space="preserve"> </w:t>
       </w:r>
-      <w:hyperlink w:history="1" r:id="rId09tgxjq3otdwauvkf8ffm">
+      <w:hyperlink w:history="1" r:id="rIda6jrttmhas-ftivy1x-gu">
         <w:r>
           <w:rPr>
             <w:rStyle w:val="Hyperlink"/>
@@ -7086,7 +7086,7 @@
         </w:rPr>
         <w:t xml:space="preserve"> </w:t>
       </w:r>
-      <w:hyperlink w:history="1" r:id="rIdu-quuqlf2knxlnebq1fut">
+      <w:hyperlink w:history="1" r:id="rIdhymxkr1he_4r3t_o56d-p">
         <w:r>
           <w:rPr>
             <w:rStyle w:val="Hyperlink"/>
@@ -7116,7 +7116,7 @@
         </w:rPr>
         <w:t xml:space="preserve"> </w:t>
       </w:r>
-      <w:hyperlink w:history="1" r:id="rIdjerkcj7t7ur0ov7eyswrq">
+      <w:hyperlink w:history="1" r:id="rId0smzlmvd5et2lvdwfpzja">
         <w:r>
           <w:rPr>
             <w:rStyle w:val="Hyperlink"/>

</xml_diff>

<commit_message>
Add live contract builder page, linked from both presentations
builder.html is a form version of the CS contract builder: class, state,
indication, SUD history, concurrent CS, situational flags, tier and
naloxone (suggested or overridden). The summary, an overview graphic of
all 36 blocks and the full agreement text update on every change, colour
tagged like the presentation; copy text, download .txt, shareable URL.

Assembly rules move to assets/cs-logic.mjs, shared by the build and the
browser so the builder and presentation cannot drift (output unchanged).

Co-Authored-By: Claude Opus 5.5 <noreply@anthropic.com>
Claude-Session: https://claude.ai/code/session_014iqtVQZmni32eDvTQgfnDb
</commit_message>
<xml_diff>
--- a/downloads/Controlled-Substance-Agreement-Clause-Library.docx
+++ b/downloads/Controlled-Substance-Agreement-Clause-Library.docx
@@ -6652,7 +6652,7 @@
         </w:rPr>
         <w:t xml:space="preserve"> </w:t>
       </w:r>
-      <w:hyperlink w:history="1" r:id="rIdoabt4lzyuhjhaunb0hh61">
+      <w:hyperlink w:history="1" r:id="rIdnihj9y_s7jd_fmiig4cfl">
         <w:r>
           <w:rPr>
             <w:rStyle w:val="Hyperlink"/>
@@ -6682,7 +6682,7 @@
         </w:rPr>
         <w:t xml:space="preserve"> </w:t>
       </w:r>
-      <w:hyperlink w:history="1" r:id="rIduwyowmxxqvjvuv4pkyioi">
+      <w:hyperlink w:history="1" r:id="rId_j-pi4filwp3w-jugq4y6">
         <w:r>
           <w:rPr>
             <w:rStyle w:val="Hyperlink"/>
@@ -6712,7 +6712,7 @@
         </w:rPr>
         <w:t xml:space="preserve"> </w:t>
       </w:r>
-      <w:hyperlink w:history="1" r:id="rIderfejw12mxvjyoutryx4j">
+      <w:hyperlink w:history="1" r:id="rId5w-o9y8uwx44noybrhibw">
         <w:r>
           <w:rPr>
             <w:rStyle w:val="Hyperlink"/>
@@ -6742,7 +6742,7 @@
         </w:rPr>
         <w:t xml:space="preserve"> </w:t>
       </w:r>
-      <w:hyperlink w:history="1" r:id="rIdt3ht4lgacwlvutfmm1_ta">
+      <w:hyperlink w:history="1" r:id="rIdlpxzfe8ecczkgjsanzzme">
         <w:r>
           <w:rPr>
             <w:rStyle w:val="Hyperlink"/>
@@ -6772,7 +6772,7 @@
         </w:rPr>
         <w:t xml:space="preserve"> </w:t>
       </w:r>
-      <w:hyperlink w:history="1" r:id="rIdmpbhpbnk8ztprphdeam0_">
+      <w:hyperlink w:history="1" r:id="rIdzdr5lwbhtayuvfcr8zjrj">
         <w:r>
           <w:rPr>
             <w:rStyle w:val="Hyperlink"/>
@@ -6815,7 +6815,7 @@
         </w:rPr>
         <w:t xml:space="preserve"> </w:t>
       </w:r>
-      <w:hyperlink w:history="1" r:id="rIdvi3nmteybpp4lsjcqhewt">
+      <w:hyperlink w:history="1" r:id="rId6mmymgq3qmusl54alylgf">
         <w:r>
           <w:rPr>
             <w:rStyle w:val="Hyperlink"/>
@@ -6871,7 +6871,7 @@
         </w:rPr>
         <w:t xml:space="preserve"> </w:t>
       </w:r>
-      <w:hyperlink w:history="1" r:id="rIdmv0307bz-nogu5ddqyobs">
+      <w:hyperlink w:history="1" r:id="rIdttncfw2upbiyc-90zr6ai">
         <w:r>
           <w:rPr>
             <w:rStyle w:val="Hyperlink"/>
@@ -6901,7 +6901,7 @@
         </w:rPr>
         <w:t xml:space="preserve"> </w:t>
       </w:r>
-      <w:hyperlink w:history="1" r:id="rIdhmn2heogvctr7iggwlshf">
+      <w:hyperlink w:history="1" r:id="rId13ka6kbr3wiaskf_xh8a9">
         <w:r>
           <w:rPr>
             <w:rStyle w:val="Hyperlink"/>
@@ -6996,7 +6996,7 @@
         </w:rPr>
         <w:t xml:space="preserve"> </w:t>
       </w:r>
-      <w:hyperlink w:history="1" r:id="rIdogxiboknwc71g0jbs8tzy">
+      <w:hyperlink w:history="1" r:id="rIdfua0pn4kbae5qg489nyyb">
         <w:r>
           <w:rPr>
             <w:rStyle w:val="Hyperlink"/>
@@ -7026,7 +7026,7 @@
         </w:rPr>
         <w:t xml:space="preserve"> </w:t>
       </w:r>
-      <w:hyperlink w:history="1" r:id="rIdx5vgto4wrovoaiugaqa7s">
+      <w:hyperlink w:history="1" r:id="rIdcdcipt_xdq0nxh1xndhqa">
         <w:r>
           <w:rPr>
             <w:rStyle w:val="Hyperlink"/>
@@ -7056,7 +7056,7 @@
         </w:rPr>
         <w:t xml:space="preserve"> </w:t>
       </w:r>
-      <w:hyperlink w:history="1" r:id="rIdzvmssnimdkgmybhf4zw-k">
+      <w:hyperlink w:history="1" r:id="rIdz8j14uyazxrobbj3gpfjc">
         <w:r>
           <w:rPr>
             <w:rStyle w:val="Hyperlink"/>
@@ -7086,7 +7086,7 @@
         </w:rPr>
         <w:t xml:space="preserve"> </w:t>
       </w:r>
-      <w:hyperlink w:history="1" r:id="rIdmvcxwlqeiqfx339fmjaue">
+      <w:hyperlink w:history="1" r:id="rIdik7oxedmni9azzgqkbthu">
         <w:r>
           <w:rPr>
             <w:rStyle w:val="Hyperlink"/>
@@ -7116,7 +7116,7 @@
         </w:rPr>
         <w:t xml:space="preserve"> </w:t>
       </w:r>
-      <w:hyperlink w:history="1" r:id="rId2geahaf1l3b4179kg5or9">
+      <w:hyperlink w:history="1" r:id="rIdpebnxb5k4ipidftkipdpr">
         <w:r>
           <w:rPr>
             <w:rStyle w:val="Hyperlink"/>

</xml_diff>

<commit_message>
Builder: default indication to Established
Co-Authored-By: Claude Opus 5.5 <noreply@anthropic.com>
Claude-Session: https://claude.ai/code/session_014iqtVQZmni32eDvTQgfnDb
</commit_message>
<xml_diff>
--- a/downloads/Controlled-Substance-Agreement-Clause-Library.docx
+++ b/downloads/Controlled-Substance-Agreement-Clause-Library.docx
@@ -6652,7 +6652,7 @@
         </w:rPr>
         <w:t xml:space="preserve"> </w:t>
       </w:r>
-      <w:hyperlink w:history="1" r:id="rIdnihj9y_s7jd_fmiig4cfl">
+      <w:hyperlink w:history="1" r:id="rIdqpphbg8aak08thhisytiu">
         <w:r>
           <w:rPr>
             <w:rStyle w:val="Hyperlink"/>
@@ -6682,7 +6682,7 @@
         </w:rPr>
         <w:t xml:space="preserve"> </w:t>
       </w:r>
-      <w:hyperlink w:history="1" r:id="rId_j-pi4filwp3w-jugq4y6">
+      <w:hyperlink w:history="1" r:id="rId1oblx8ik9pvocheyd_rpc">
         <w:r>
           <w:rPr>
             <w:rStyle w:val="Hyperlink"/>
@@ -6712,7 +6712,7 @@
         </w:rPr>
         <w:t xml:space="preserve"> </w:t>
       </w:r>
-      <w:hyperlink w:history="1" r:id="rId5w-o9y8uwx44noybrhibw">
+      <w:hyperlink w:history="1" r:id="rIdyvzp7bxukrk28zwpu9m9c">
         <w:r>
           <w:rPr>
             <w:rStyle w:val="Hyperlink"/>
@@ -6742,7 +6742,7 @@
         </w:rPr>
         <w:t xml:space="preserve"> </w:t>
       </w:r>
-      <w:hyperlink w:history="1" r:id="rIdlpxzfe8ecczkgjsanzzme">
+      <w:hyperlink w:history="1" r:id="rIdxuppy0kxuh-mse9kbpe8z">
         <w:r>
           <w:rPr>
             <w:rStyle w:val="Hyperlink"/>
@@ -6772,7 +6772,7 @@
         </w:rPr>
         <w:t xml:space="preserve"> </w:t>
       </w:r>
-      <w:hyperlink w:history="1" r:id="rIdzdr5lwbhtayuvfcr8zjrj">
+      <w:hyperlink w:history="1" r:id="rIdbmyfzpnuqq4pi8vyq_qkb">
         <w:r>
           <w:rPr>
             <w:rStyle w:val="Hyperlink"/>
@@ -6815,7 +6815,7 @@
         </w:rPr>
         <w:t xml:space="preserve"> </w:t>
       </w:r>
-      <w:hyperlink w:history="1" r:id="rId6mmymgq3qmusl54alylgf">
+      <w:hyperlink w:history="1" r:id="rIdtdhdlf5tapo0vrmamdzbi">
         <w:r>
           <w:rPr>
             <w:rStyle w:val="Hyperlink"/>
@@ -6871,7 +6871,7 @@
         </w:rPr>
         <w:t xml:space="preserve"> </w:t>
       </w:r>
-      <w:hyperlink w:history="1" r:id="rIdttncfw2upbiyc-90zr6ai">
+      <w:hyperlink w:history="1" r:id="rId59_7xhvhevxh3oyypnwv5">
         <w:r>
           <w:rPr>
             <w:rStyle w:val="Hyperlink"/>
@@ -6901,7 +6901,7 @@
         </w:rPr>
         <w:t xml:space="preserve"> </w:t>
       </w:r>
-      <w:hyperlink w:history="1" r:id="rId13ka6kbr3wiaskf_xh8a9">
+      <w:hyperlink w:history="1" r:id="rIdwbxxotymaelzud7kkqk9f">
         <w:r>
           <w:rPr>
             <w:rStyle w:val="Hyperlink"/>
@@ -6996,7 +6996,7 @@
         </w:rPr>
         <w:t xml:space="preserve"> </w:t>
       </w:r>
-      <w:hyperlink w:history="1" r:id="rIdfua0pn4kbae5qg489nyyb">
+      <w:hyperlink w:history="1" r:id="rIduxeigmwoomwlgdtzyo-kv">
         <w:r>
           <w:rPr>
             <w:rStyle w:val="Hyperlink"/>
@@ -7026,7 +7026,7 @@
         </w:rPr>
         <w:t xml:space="preserve"> </w:t>
       </w:r>
-      <w:hyperlink w:history="1" r:id="rIdcdcipt_xdq0nxh1xndhqa">
+      <w:hyperlink w:history="1" r:id="rIdwadijx2yzdcj29ljkuizn">
         <w:r>
           <w:rPr>
             <w:rStyle w:val="Hyperlink"/>
@@ -7056,7 +7056,7 @@
         </w:rPr>
         <w:t xml:space="preserve"> </w:t>
       </w:r>
-      <w:hyperlink w:history="1" r:id="rIdz8j14uyazxrobbj3gpfjc">
+      <w:hyperlink w:history="1" r:id="rIdt2kf7vkpv8x4-h3fhmfgh">
         <w:r>
           <w:rPr>
             <w:rStyle w:val="Hyperlink"/>
@@ -7086,7 +7086,7 @@
         </w:rPr>
         <w:t xml:space="preserve"> </w:t>
       </w:r>
-      <w:hyperlink w:history="1" r:id="rIdik7oxedmni9azzgqkbthu">
+      <w:hyperlink w:history="1" r:id="rIdeyfz2ck7dlaioltr9ghov">
         <w:r>
           <w:rPr>
             <w:rStyle w:val="Hyperlink"/>
@@ -7116,7 +7116,7 @@
         </w:rPr>
         <w:t xml:space="preserve"> </w:t>
       </w:r>
-      <w:hyperlink w:history="1" r:id="rIdpebnxb5k4ipidftkipdpr">
+      <w:hyperlink w:history="1" r:id="rId9lanikcf7nmkbrjzbom3p">
         <w:r>
           <w:rPr>
             <w:rStyle w:val="Hyperlink"/>

</xml_diff>